<commit_message>
reunion 2 new texts + justify + data menu
</commit_message>
<xml_diff>
--- a/web/front/benjamin/Package Site Web/Eléments site web.docx
+++ b/web/front/benjamin/Package Site Web/Eléments site web.docx
@@ -189,6 +189,7 @@
           <w:szCs w:val="28"/>
         </w:rPr>
       </w:pPr>
+      <w:proofErr w:type="gramStart"/>
       <w:r>
         <w:rPr>
           <w:b/>
@@ -214,7 +215,17 @@
           <w:sz w:val="28"/>
           <w:szCs w:val="28"/>
         </w:rPr>
-        <w:t xml:space="preserve"> l’onglet </w:t>
+        <w:t xml:space="preserve"> l’onglet</w:t>
+      </w:r>
+      <w:proofErr w:type="gramEnd"/>
+      <w:r>
+        <w:rPr>
+          <w:b/>
+          <w:bCs/>
+          <w:sz w:val="28"/>
+          <w:szCs w:val="28"/>
+        </w:rPr>
+        <w:t xml:space="preserve"> </w:t>
       </w:r>
       <w:r>
         <w:rPr>
@@ -304,8 +315,13 @@
               <w:t>axes</w:t>
             </w:r>
             <w:r>
-              <w:t xml:space="preserve"> principaux de recherche:</w:t>
+              <w:t xml:space="preserve"> principaux de </w:t>
             </w:r>
+            <w:proofErr w:type="gramStart"/>
+            <w:r>
+              <w:t>recherche:</w:t>
+            </w:r>
+            <w:proofErr w:type="gramEnd"/>
           </w:p>
         </w:tc>
         <w:tc>
@@ -453,7 +469,15 @@
               <w:t xml:space="preserve">Axe 2 : </w:t>
             </w:r>
             <w:r>
-              <w:t>Impact de l’exposome sur la santé</w:t>
+              <w:t>Impact de l’</w:t>
+            </w:r>
+            <w:proofErr w:type="spellStart"/>
+            <w:r>
+              <w:t>exposome</w:t>
+            </w:r>
+            <w:proofErr w:type="spellEnd"/>
+            <w:r>
+              <w:t xml:space="preserve"> sur la santé</w:t>
             </w:r>
             <w:r>
               <w:br/>
@@ -469,7 +493,15 @@
               <w:jc w:val="both"/>
             </w:pPr>
             <w:r>
-              <w:t>Analyse de l’impact de l'environnement (particules fines, soleil, perturbateurs endocriniens,…) sur différentes pathologies.</w:t>
+              <w:t xml:space="preserve">Analyse de l’impact de l'environnement (particules fines, soleil, perturbateurs </w:t>
+            </w:r>
+            <w:proofErr w:type="gramStart"/>
+            <w:r>
+              <w:t>endocriniens,…</w:t>
+            </w:r>
+            <w:proofErr w:type="gramEnd"/>
+            <w:r>
+              <w:t>) sur différentes pathologies.</w:t>
             </w:r>
           </w:p>
           <w:p>
@@ -770,9 +802,6 @@
         </w:rPr>
       </w:pPr>
       <w:r>
-        <w:rPr>
-          <w:lang w:val="en-US"/>
-        </w:rPr>
         <w:t xml:space="preserve">BARGNA, L., LA TORRE, D., MAGGISTRO, R. et MONTMARTIN, B. (2026). </w:t>
       </w:r>
       <w:r>
@@ -809,8 +838,29 @@
           <w:lang w:val="en-US"/>
         </w:rPr>
       </w:pPr>
-      <w:r>
-        <w:t>Crouzat, A., Cremoni, M., Boukaïdi, S., Seitz-Polski, B., &amp; Gauci, P. A. (202</w:t>
+      <w:proofErr w:type="spellStart"/>
+      <w:r>
+        <w:t>Crouzat</w:t>
+      </w:r>
+      <w:proofErr w:type="spellEnd"/>
+      <w:r>
+        <w:t xml:space="preserve">, A., </w:t>
+      </w:r>
+      <w:proofErr w:type="spellStart"/>
+      <w:r>
+        <w:t>Cremoni</w:t>
+      </w:r>
+      <w:proofErr w:type="spellEnd"/>
+      <w:r>
+        <w:t xml:space="preserve">, M., </w:t>
+      </w:r>
+      <w:proofErr w:type="spellStart"/>
+      <w:r>
+        <w:t>Boukaïdi</w:t>
+      </w:r>
+      <w:proofErr w:type="spellEnd"/>
+      <w:r>
+        <w:t>, S., Seitz-Polski, B., &amp; Gauci, P. A. (202</w:t>
       </w:r>
       <w:r>
         <w:t>6</w:t>
@@ -840,7 +890,29 @@
           <w:iCs/>
           <w:lang w:val="en-US"/>
         </w:rPr>
-        <w:t>Reproductive BioMedicine Online</w:t>
+        <w:t xml:space="preserve">Reproductive </w:t>
+      </w:r>
+      <w:proofErr w:type="spellStart"/>
+      <w:r>
+        <w:rPr>
+          <w:b/>
+          <w:bCs/>
+          <w:i/>
+          <w:iCs/>
+          <w:lang w:val="en-US"/>
+        </w:rPr>
+        <w:t>BioMedicine</w:t>
+      </w:r>
+      <w:proofErr w:type="spellEnd"/>
+      <w:r>
+        <w:rPr>
+          <w:b/>
+          <w:bCs/>
+          <w:i/>
+          <w:iCs/>
+          <w:lang w:val="en-US"/>
+        </w:rPr>
+        <w:t xml:space="preserve"> Online</w:t>
       </w:r>
       <w:r>
         <w:rPr>
@@ -864,35 +936,140 @@
         <w:rPr>
           <w:lang w:val="en-US"/>
         </w:rPr>
-        <w:t xml:space="preserve"> Lien internet : </w:t>
+        <w:t xml:space="preserve"> Lien </w:t>
+      </w:r>
+      <w:proofErr w:type="gramStart"/>
+      <w:r>
+        <w:rPr>
+          <w:lang w:val="en-US"/>
+        </w:rPr>
+        <w:t>internet :</w:t>
+      </w:r>
+      <w:proofErr w:type="gramEnd"/>
+      <w:r>
+        <w:rPr>
+          <w:lang w:val="en-US"/>
+        </w:rPr>
+        <w:t xml:space="preserve"> </w:t>
+      </w:r>
+      <w:r>
+        <w:fldChar w:fldCharType="begin"/>
+      </w:r>
+      <w:r>
+        <w:rPr>
+          <w:lang w:val="en-US"/>
+        </w:rPr>
+        <w:instrText>HYPERLINK "https://www.rbmojournal.com/article/S1472-6483(25)00625-X/fulltext"</w:instrText>
+      </w:r>
+      <w:r>
+        <w:fldChar w:fldCharType="separate"/>
+      </w:r>
+      <w:r>
+        <w:rPr>
+          <w:rStyle w:val="Lienhypertexte"/>
+          <w:lang w:val="en-US"/>
+        </w:rPr>
+        <w:t>https://www.rbmojournal.com/article/S1472-6483(25)00625-X/fulltext</w:t>
+      </w:r>
+      <w:r>
+        <w:fldChar w:fldCharType="end"/>
+      </w:r>
+    </w:p>
+    <w:p>
+      <w:r>
+        <w:rPr>
+          <w:lang w:val="en-US"/>
+        </w:rPr>
+        <w:t xml:space="preserve">Allouche J, </w:t>
+      </w:r>
+      <w:proofErr w:type="spellStart"/>
+      <w:r>
+        <w:rPr>
+          <w:lang w:val="en-US"/>
+        </w:rPr>
+        <w:t>Cremoni</w:t>
+      </w:r>
+      <w:proofErr w:type="spellEnd"/>
+      <w:r>
+        <w:rPr>
+          <w:lang w:val="en-US"/>
+        </w:rPr>
+        <w:t xml:space="preserve"> M, Brglez V, Graça D, Benzaken S, Zorzi K, Fernandez C, Esnault V, </w:t>
+      </w:r>
+      <w:proofErr w:type="spellStart"/>
+      <w:r>
+        <w:rPr>
+          <w:lang w:val="en-US"/>
+        </w:rPr>
+        <w:t>Levraut</w:t>
+      </w:r>
+      <w:proofErr w:type="spellEnd"/>
+      <w:r>
+        <w:rPr>
+          <w:lang w:val="en-US"/>
+        </w:rPr>
+        <w:t xml:space="preserve"> M, Oppo S, Jacquinot M, </w:t>
+      </w:r>
+      <w:proofErr w:type="spellStart"/>
+      <w:r>
+        <w:rPr>
+          <w:lang w:val="en-US"/>
+        </w:rPr>
+        <w:t>Armengaud</w:t>
+      </w:r>
+      <w:proofErr w:type="spellEnd"/>
+      <w:r>
+        <w:rPr>
+          <w:lang w:val="en-US"/>
+        </w:rPr>
+        <w:t xml:space="preserve"> A, Pradier C, Bailly L, Seitz-Polski B. (2022), “Air pollution exposure induces a decrease in type II interferon response: A paired cohort study”, </w:t>
+      </w:r>
+      <w:proofErr w:type="spellStart"/>
+      <w:r>
+        <w:rPr>
+          <w:lang w:val="en-US"/>
+        </w:rPr>
+        <w:t>EBioMedicine</w:t>
+      </w:r>
+      <w:proofErr w:type="spellEnd"/>
+      <w:r>
+        <w:rPr>
+          <w:lang w:val="en-US"/>
+        </w:rPr>
+        <w:t xml:space="preserve">, Volume 85, 104291, </w:t>
+      </w:r>
+      <w:proofErr w:type="spellStart"/>
+      <w:r>
+        <w:rPr>
+          <w:lang w:val="en-US"/>
+        </w:rPr>
+        <w:t>doi</w:t>
+      </w:r>
+      <w:proofErr w:type="spellEnd"/>
+      <w:r>
+        <w:rPr>
+          <w:lang w:val="en-US"/>
+        </w:rPr>
+        <w:t>: 10.1016/j.ebiom.2022.104291</w:t>
+      </w:r>
+      <w:r>
+        <w:rPr>
+          <w:lang w:val="en-US"/>
+        </w:rPr>
+        <w:t xml:space="preserve">. </w:t>
+      </w:r>
+      <w:r>
+        <w:t xml:space="preserve">Lien </w:t>
+      </w:r>
+      <w:proofErr w:type="gramStart"/>
+      <w:r>
+        <w:t>internet:</w:t>
+      </w:r>
+      <w:proofErr w:type="gramEnd"/>
+      <w:r>
+        <w:t xml:space="preserve"> </w:t>
       </w:r>
       <w:hyperlink r:id="rId11" w:history="1">
-        <w:r>
-          <w:rPr>
-            <w:rStyle w:val="Lienhypertexte"/>
-            <w:lang w:val="en-US"/>
-          </w:rPr>
-          <w:t>https://www.rbmojournal.com/article/S1472-6483(25)00625-X/fulltext</w:t>
-        </w:r>
-      </w:hyperlink>
-    </w:p>
-    <w:p>
-      <w:r>
-        <w:rPr>
-          <w:lang w:val="en-US"/>
-        </w:rPr>
-        <w:t>Allouche J, Cremoni M, Brglez V, Graça D, Benzaken S, Zorzi K, Fernandez C, Esnault V, Levraut M, Oppo S, Jacquinot M, Armengaud A, Pradier C, Bailly L, Seitz-Polski B. (2022), “Air pollution exposure induces a decrease in type II interferon response: A paired cohort study”, EBioMedicine, Volume 85, 104291, doi: 10.1016/j.ebiom.2022.104291</w:t>
-      </w:r>
-      <w:r>
-        <w:rPr>
-          <w:lang w:val="en-US"/>
-        </w:rPr>
-        <w:t xml:space="preserve">. </w:t>
-      </w:r>
-      <w:r>
-        <w:t xml:space="preserve">Lien internet: </w:t>
-      </w:r>
-      <w:hyperlink r:id="rId12" w:history="1">
         <w:r>
           <w:rPr>
             <w:rStyle w:val="Lienhypertexte"/>
@@ -903,15 +1080,21 @@
     </w:p>
     <w:p>
       <w:r>
+        <w:rPr>
+          <w:lang w:val="en-US"/>
+        </w:rPr>
         <w:t>Cremoni M, Agbekodo S, Teisseyre M, Zorzi K, Brglez V, Benzaken S, Esnault V, Planchard JH, Seitz-Polski B., (2022) “Toxic Occupational Exposures and Membranous Nephropathy”, Clinical Journal of the American Society of Nephrology, Volume 17(11), p.1609-1619. doi: 10.2215/CJN.02930322</w:t>
       </w:r>
       <w:r>
-        <w:t>.</w:t>
-      </w:r>
-      <w:r>
-        <w:t xml:space="preserve"> Lien : </w:t>
-      </w:r>
-      <w:hyperlink r:id="rId13" w:history="1">
+        <w:rPr>
+          <w:lang w:val="en-US"/>
+        </w:rPr>
+        <w:t xml:space="preserve">. </w:t>
+      </w:r>
+      <w:r>
+        <w:t xml:space="preserve">Lien : </w:t>
+      </w:r>
+      <w:hyperlink r:id="rId12" w:history="1">
         <w:r>
           <w:rPr>
             <w:rStyle w:val="Lienhypertexte"/>
@@ -935,8 +1118,36 @@
           <w:bCs/>
           <w:lang w:val="en-US"/>
         </w:rPr>
-        <w:t>Travaux en cours</w:t>
-      </w:r>
+        <w:t xml:space="preserve">Travaux </w:t>
+      </w:r>
+      <w:proofErr w:type="spellStart"/>
+      <w:r>
+        <w:rPr>
+          <w:b/>
+          <w:bCs/>
+          <w:lang w:val="en-US"/>
+        </w:rPr>
+        <w:t>en</w:t>
+      </w:r>
+      <w:proofErr w:type="spellEnd"/>
+      <w:r>
+        <w:rPr>
+          <w:b/>
+          <w:bCs/>
+          <w:lang w:val="en-US"/>
+        </w:rPr>
+        <w:t xml:space="preserve"> </w:t>
+      </w:r>
+      <w:proofErr w:type="spellStart"/>
+      <w:r>
+        <w:rPr>
+          <w:b/>
+          <w:bCs/>
+          <w:lang w:val="en-US"/>
+        </w:rPr>
+        <w:t>cours</w:t>
+      </w:r>
+      <w:proofErr w:type="spellEnd"/>
     </w:p>
     <w:p>
       <w:pPr>
@@ -950,11 +1161,33 @@
           <w:lang w:val="en-US"/>
         </w:rPr>
       </w:pPr>
-      <w:r>
-        <w:rPr>
-          <w:lang w:val="en-US"/>
-        </w:rPr>
-        <w:t>Lambotte M. &amp; Montmartin B., “</w:t>
+      <w:proofErr w:type="spellStart"/>
+      <w:r>
+        <w:rPr>
+          <w:lang w:val="en-US"/>
+        </w:rPr>
+        <w:t>Lambotte</w:t>
+      </w:r>
+      <w:proofErr w:type="spellEnd"/>
+      <w:r>
+        <w:rPr>
+          <w:lang w:val="en-US"/>
+        </w:rPr>
+        <w:t xml:space="preserve"> M. &amp; </w:t>
+      </w:r>
+      <w:proofErr w:type="spellStart"/>
+      <w:r>
+        <w:rPr>
+          <w:lang w:val="en-US"/>
+        </w:rPr>
+        <w:t>Montmartin</w:t>
+      </w:r>
+      <w:proofErr w:type="spellEnd"/>
+      <w:r>
+        <w:rPr>
+          <w:lang w:val="en-US"/>
+        </w:rPr>
+        <w:t xml:space="preserve"> B., “</w:t>
       </w:r>
       <w:r>
         <w:rPr>
@@ -987,7 +1220,21 @@
         <w:rPr>
           <w:lang w:val="en-US"/>
         </w:rPr>
-        <w:t>Gauci P.A &amp; Montmartin B.,</w:t>
+        <w:t xml:space="preserve">Gauci P.A &amp; </w:t>
+      </w:r>
+      <w:proofErr w:type="spellStart"/>
+      <w:r>
+        <w:rPr>
+          <w:lang w:val="en-US"/>
+        </w:rPr>
+        <w:t>Montmartin</w:t>
+      </w:r>
+      <w:proofErr w:type="spellEnd"/>
+      <w:r>
+        <w:rPr>
+          <w:lang w:val="en-US"/>
+        </w:rPr>
+        <w:t xml:space="preserve"> B.,</w:t>
       </w:r>
       <w:r>
         <w:rPr>
@@ -1019,11 +1266,33 @@
           <w:lang w:val="en-US"/>
         </w:rPr>
       </w:pPr>
-      <w:r>
-        <w:rPr>
-          <w:lang w:val="en-US"/>
-        </w:rPr>
-        <w:t>Montmartin B., Laffineur C. &amp; Gauci P.A,</w:t>
+      <w:proofErr w:type="spellStart"/>
+      <w:r>
+        <w:rPr>
+          <w:lang w:val="en-US"/>
+        </w:rPr>
+        <w:t>Montmartin</w:t>
+      </w:r>
+      <w:proofErr w:type="spellEnd"/>
+      <w:r>
+        <w:rPr>
+          <w:lang w:val="en-US"/>
+        </w:rPr>
+        <w:t xml:space="preserve"> B., </w:t>
+      </w:r>
+      <w:proofErr w:type="spellStart"/>
+      <w:r>
+        <w:rPr>
+          <w:lang w:val="en-US"/>
+        </w:rPr>
+        <w:t>Laffineur</w:t>
+      </w:r>
+      <w:proofErr w:type="spellEnd"/>
+      <w:r>
+        <w:rPr>
+          <w:lang w:val="en-US"/>
+        </w:rPr>
+        <w:t xml:space="preserve"> C. &amp; Gauci P.A,</w:t>
       </w:r>
       <w:r>
         <w:rPr>
@@ -1086,9 +1355,17 @@
     </w:p>
     <w:p>
       <w:r>
-        <w:t xml:space="preserve">2026 : Reconvertion professionnelle : désir et obstacle. Lien internet : </w:t>
-      </w:r>
-      <w:hyperlink r:id="rId14" w:history="1">
+        <w:t xml:space="preserve">2026 : </w:t>
+      </w:r>
+      <w:proofErr w:type="spellStart"/>
+      <w:r>
+        <w:t>Reconvertion</w:t>
+      </w:r>
+      <w:proofErr w:type="spellEnd"/>
+      <w:r>
+        <w:t xml:space="preserve"> professionnelle : désir et obstacle. Lien internet : </w:t>
+      </w:r>
+      <w:hyperlink r:id="rId13" w:history="1">
         <w:r>
           <w:rPr>
             <w:rStyle w:val="Lienhypertexte"/>
@@ -1111,12 +1388,20 @@
         <w:t>Les avantages de l'installation obligatoire</w:t>
       </w:r>
       <w:r>
-        <w:t>, publié par SKEMA Publika, lien internet :</w:t>
+        <w:t xml:space="preserve">, publié par SKEMA </w:t>
+      </w:r>
+      <w:proofErr w:type="spellStart"/>
+      <w:r>
+        <w:t>Publika</w:t>
+      </w:r>
+      <w:proofErr w:type="spellEnd"/>
+      <w:r>
+        <w:t>, lien internet :</w:t>
       </w:r>
       <w:r>
         <w:t xml:space="preserve"> </w:t>
       </w:r>
-      <w:hyperlink r:id="rId15" w:history="1">
+      <w:hyperlink r:id="rId14" w:history="1">
         <w:r>
           <w:rPr>
             <w:rStyle w:val="Lienhypertexte"/>
@@ -1126,8 +1411,40 @@
       </w:hyperlink>
     </w:p>
     <w:p>
-      <w:r>
-        <w:t>2024: Etude sur les Dépassements d’honoraires, publié par </w:t>
+      <w:proofErr w:type="gramStart"/>
+      <w:r>
+        <w:t>2024:</w:t>
+      </w:r>
+      <w:proofErr w:type="gramEnd"/>
+      <w:r>
+        <w:t> Etude sur les Dépassements d’honoraires, publié par </w:t>
+      </w:r>
+      <w:hyperlink r:id="rId15" w:tgtFrame="_blank" w:history="1">
+        <w:r>
+          <w:rPr>
+            <w:rStyle w:val="Lienhypertexte"/>
+          </w:rPr>
+          <w:t>UFC que Choisir</w:t>
+        </w:r>
+      </w:hyperlink>
+    </w:p>
+    <w:p>
+      <w:proofErr w:type="gramStart"/>
+      <w:r>
+        <w:t>2023:</w:t>
+      </w:r>
+      <w:proofErr w:type="gramEnd"/>
+      <w:r>
+        <w:t xml:space="preserve"> </w:t>
+      </w:r>
+      <w:r>
+        <w:t xml:space="preserve">Etude sur </w:t>
+      </w:r>
+      <w:r>
+        <w:t>l’a</w:t>
+      </w:r>
+      <w:r>
+        <w:t>ggravation de l’accès aux soins, publié par </w:t>
       </w:r>
       <w:hyperlink r:id="rId16" w:tgtFrame="_blank" w:history="1">
         <w:r>
@@ -1139,17 +1456,13 @@
       </w:hyperlink>
     </w:p>
     <w:p>
-      <w:r>
-        <w:t xml:space="preserve">2023: </w:t>
-      </w:r>
-      <w:r>
-        <w:t xml:space="preserve">Etude sur </w:t>
-      </w:r>
-      <w:r>
-        <w:t>l’a</w:t>
-      </w:r>
-      <w:r>
-        <w:t>ggravation de l’accès aux soins, publié par </w:t>
+      <w:proofErr w:type="gramStart"/>
+      <w:r>
+        <w:t>2023:</w:t>
+      </w:r>
+      <w:proofErr w:type="gramEnd"/>
+      <w:r>
+        <w:t> Etude sur la tension dans les services d'urgences, publié par </w:t>
       </w:r>
       <w:hyperlink r:id="rId17" w:tgtFrame="_blank" w:history="1">
         <w:r>
@@ -1161,8 +1474,21 @@
       </w:hyperlink>
     </w:p>
     <w:p>
-      <w:r>
-        <w:t>2023: Etude sur la tension dans les services d'urgences, publié par </w:t>
+      <w:proofErr w:type="gramStart"/>
+      <w:r>
+        <w:t>2022:</w:t>
+      </w:r>
+      <w:proofErr w:type="gramEnd"/>
+      <w:r>
+        <w:t xml:space="preserve"> Etude sur </w:t>
+      </w:r>
+      <w:proofErr w:type="gramStart"/>
+      <w:r>
+        <w:t>le fracture sanitaire</w:t>
+      </w:r>
+      <w:proofErr w:type="gramEnd"/>
+      <w:r>
+        <w:t xml:space="preserve"> et les déserts médicaux, publié par </w:t>
       </w:r>
       <w:hyperlink r:id="rId18" w:tgtFrame="_blank" w:history="1">
         <w:r>
@@ -1173,19 +1499,6 @@
         </w:r>
       </w:hyperlink>
     </w:p>
-    <w:p>
-      <w:r>
-        <w:t>2022: Etude sur le fracture sanitaire et les déserts médicaux, publié par </w:t>
-      </w:r>
-      <w:hyperlink r:id="rId19" w:tgtFrame="_blank" w:history="1">
-        <w:r>
-          <w:rPr>
-            <w:rStyle w:val="Lienhypertexte"/>
-          </w:rPr>
-          <w:t>UFC que Choisir</w:t>
-        </w:r>
-      </w:hyperlink>
-    </w:p>
     <w:p/>
     <w:p>
       <w:pPr>
@@ -1236,7 +1549,15 @@
         <w:t xml:space="preserve">un sous-onglet </w:t>
       </w:r>
       <w:r>
-        <w:t xml:space="preserve">« Accessibilité aux autres services de santé »  (pharmacie, </w:t>
+        <w:t>« Accessibilité aux autres services de santé </w:t>
+      </w:r>
+      <w:proofErr w:type="gramStart"/>
+      <w:r>
+        <w:t>»  (</w:t>
+      </w:r>
+      <w:proofErr w:type="gramEnd"/>
+      <w:r>
+        <w:t xml:space="preserve">pharmacie, </w:t>
       </w:r>
       <w:r>
         <w:t>EPHAD</w:t>
@@ -1316,8 +1637,13 @@
         <w:t xml:space="preserve">Enlever </w:t>
       </w:r>
       <w:r>
-        <w:t>le terme Membre fondateur et ajouter les deux photos en dessous des précentes</w:t>
-      </w:r>
+        <w:t xml:space="preserve">le terme Membre fondateur et ajouter les deux photos en dessous des </w:t>
+      </w:r>
+      <w:proofErr w:type="spellStart"/>
+      <w:r>
+        <w:t>précentes</w:t>
+      </w:r>
+      <w:proofErr w:type="spellEnd"/>
     </w:p>
     <w:p>
       <w:pPr>
@@ -1397,7 +1723,7 @@
       <w:r>
         <w:t xml:space="preserve"> : </w:t>
       </w:r>
-      <w:hyperlink r:id="rId20" w:history="1">
+      <w:hyperlink r:id="rId19" w:history="1">
         <w:r>
           <w:rPr>
             <w:rStyle w:val="Lienhypertexte"/>
@@ -1413,7 +1739,15 @@
     </w:p>
     <w:p>
       <w:r>
-        <w:t xml:space="preserve">Université Côte d’Azur est l'une des 9 universités françaises "IdEx" intensive en recherche et à fort rayonnement international. Structurée autour de composantes internes novatrices, les Ecoles Universitaires de recherche, dont les responsabilités sont accrues pour une plus grande agilité, Université Côte d’Azur adosse l’ensemble de ses missions de formation et d'innovation à l’excellence de sa recherche. Son fort ancrage au territoire azuréen en fait l’un des moteurs de son modèle de croissance. Membre fondatrice de l’alliance européenne Ulysseus, porteuse de l’un des quatre </w:t>
+        <w:t>Université Côte d’Azur est l'une des 9 universités françaises "</w:t>
+      </w:r>
+      <w:proofErr w:type="spellStart"/>
+      <w:r>
+        <w:t>IdEx</w:t>
+      </w:r>
+      <w:proofErr w:type="spellEnd"/>
+      <w:r>
+        <w:t xml:space="preserve">" intensive en recherche et à fort rayonnement international. Structurée autour de composantes internes novatrices, les Ecoles Universitaires de recherche, dont les responsabilités sont accrues pour une plus grande agilité, Université Côte d’Azur adosse l’ensemble de ses missions de formation et d'innovation à l’excellence de sa recherche. Son fort ancrage au territoire azuréen en fait l’un des moteurs de son modèle de croissance. Membre fondatrice de l’alliance européenne Ulysseus, porteuse de l’un des quatre </w:t>
       </w:r>
       <w:r>
         <w:lastRenderedPageBreak/>
@@ -1431,9 +1765,23 @@
         <w:rPr>
           <w:lang w:val="en-US"/>
         </w:rPr>
-        <w:t xml:space="preserve">SKEMA Business School : </w:t>
-      </w:r>
-      <w:hyperlink r:id="rId21" w:history="1">
+        <w:t xml:space="preserve">SKEMA Business </w:t>
+      </w:r>
+      <w:proofErr w:type="gramStart"/>
+      <w:r>
+        <w:rPr>
+          <w:lang w:val="en-US"/>
+        </w:rPr>
+        <w:t>School :</w:t>
+      </w:r>
+      <w:proofErr w:type="gramEnd"/>
+      <w:r>
+        <w:rPr>
+          <w:lang w:val="en-US"/>
+        </w:rPr>
+        <w:t xml:space="preserve"> </w:t>
+      </w:r>
+      <w:hyperlink r:id="rId20" w:history="1">
         <w:r>
           <w:rPr>
             <w:rStyle w:val="Lienhypertexte"/>
@@ -1453,7 +1801,21 @@
         <w:rPr>
           <w:lang w:val="en-US"/>
         </w:rPr>
-        <w:t>A propos de SKEMA Business School</w:t>
+        <w:t xml:space="preserve">A </w:t>
+      </w:r>
+      <w:proofErr w:type="spellStart"/>
+      <w:r>
+        <w:rPr>
+          <w:lang w:val="en-US"/>
+        </w:rPr>
+        <w:t>propos</w:t>
+      </w:r>
+      <w:proofErr w:type="spellEnd"/>
+      <w:r>
+        <w:rPr>
+          <w:lang w:val="en-US"/>
+        </w:rPr>
+        <w:t xml:space="preserve"> de SKEMA Business School</w:t>
       </w:r>
     </w:p>
     <w:p>
@@ -1463,15 +1825,39 @@
     </w:p>
     <w:p>
       <w:r>
-        <w:t>Multi-accréditée (AACSB, EQUIS, EFMD Accredited EMBA), l’école est reconnue dans le monde entier pour sa recherche, ses plus de 70 programmes d’excellence et sa structure internationale multi-sites dans sept pays : Afrique du Sud, Brésil, Canada, Chine, Émirats arabes unis, États-Unis, France. www.skema.edu</w:t>
+        <w:t xml:space="preserve">Multi-accréditée (AACSB, EQUIS, EFMD </w:t>
+      </w:r>
+      <w:proofErr w:type="spellStart"/>
+      <w:r>
+        <w:t>Accredited</w:t>
+      </w:r>
+      <w:proofErr w:type="spellEnd"/>
+      <w:r>
+        <w:t xml:space="preserve"> EMBA), l’école est reconnue dans le monde entier pour sa recherche, ses plus de 70 programmes d’excellence et sa structure internationale </w:t>
+      </w:r>
+      <w:proofErr w:type="spellStart"/>
+      <w:r>
+        <w:t>multi-sites</w:t>
+      </w:r>
+      <w:proofErr w:type="spellEnd"/>
+      <w:r>
+        <w:t xml:space="preserve"> dans sept pays : Afrique du Sud, Brésil, Canada, Chine, Émirats arabes unis, États-Unis, France. www.skema.edu</w:t>
       </w:r>
     </w:p>
     <w:p/>
     <w:p>
       <w:r>
-        <w:t xml:space="preserve">Faculté de Médecine: </w:t>
-      </w:r>
-      <w:hyperlink r:id="rId22" w:history="1">
+        <w:t xml:space="preserve">Faculté de </w:t>
+      </w:r>
+      <w:proofErr w:type="gramStart"/>
+      <w:r>
+        <w:t>Médecine:</w:t>
+      </w:r>
+      <w:proofErr w:type="gramEnd"/>
+      <w:r>
+        <w:t xml:space="preserve"> </w:t>
+      </w:r>
+      <w:hyperlink r:id="rId21" w:history="1">
         <w:r>
           <w:rPr>
             <w:rStyle w:val="Lienhypertexte"/>
@@ -1485,7 +1871,7 @@
       <w:r>
         <w:t xml:space="preserve">EUR ELMI : </w:t>
       </w:r>
-      <w:hyperlink r:id="rId23" w:history="1">
+      <w:hyperlink r:id="rId22" w:history="1">
         <w:r>
           <w:rPr>
             <w:rStyle w:val="Lienhypertexte"/>
@@ -1514,7 +1900,21 @@
         <w:rPr>
           <w:lang w:val="en-US"/>
         </w:rPr>
-        <w:t>GREDEG CNRS : https://gredeg.univ-cotedazur.fr/</w:t>
+        <w:t xml:space="preserve">GREDEG </w:t>
+      </w:r>
+      <w:proofErr w:type="gramStart"/>
+      <w:r>
+        <w:rPr>
+          <w:lang w:val="en-US"/>
+        </w:rPr>
+        <w:t>CNRS :</w:t>
+      </w:r>
+      <w:proofErr w:type="gramEnd"/>
+      <w:r>
+        <w:rPr>
+          <w:lang w:val="en-US"/>
+        </w:rPr>
+        <w:t xml:space="preserve"> https://gredeg.univ-cotedazur.fr/</w:t>
       </w:r>
     </w:p>
     <w:p>
@@ -1593,7 +1993,23 @@
           <w:b/>
           <w:bCs/>
         </w:rPr>
-        <w:t xml:space="preserve">L'Université Côte d'Azur et Skema Business School se sont associées pour créer une Chaire dédiée à la recherche sur </w:t>
+        <w:t xml:space="preserve">L'Université Côte d'Azur et </w:t>
+      </w:r>
+      <w:proofErr w:type="spellStart"/>
+      <w:r>
+        <w:rPr>
+          <w:b/>
+          <w:bCs/>
+        </w:rPr>
+        <w:t>Skema</w:t>
+      </w:r>
+      <w:proofErr w:type="spellEnd"/>
+      <w:r>
+        <w:rPr>
+          <w:b/>
+          <w:bCs/>
+        </w:rPr>
+        <w:t xml:space="preserve"> Business School se sont associées pour créer une Chaire dédiée à la recherche sur </w:t>
       </w:r>
       <w:r>
         <w:rPr>
@@ -1624,15 +2040,40 @@
           <w:b/>
           <w:bCs/>
         </w:rPr>
-        <w:t>Cette Chaire est soutenue et labelisée Initiative d'Excellence par l'Université Côte d'Azur (IdeX)</w:t>
-      </w:r>
-      <w:r>
-        <w:rPr>
-          <w:b/>
-          <w:bCs/>
-        </w:rPr>
-        <w:t xml:space="preserve"> (logo Idex</w:t>
-      </w:r>
+        <w:t>Cette Chaire est soutenue et labelisée Initiative d'Excellence par l'Université Côte d'Azur (</w:t>
+      </w:r>
+      <w:proofErr w:type="spellStart"/>
+      <w:r>
+        <w:rPr>
+          <w:b/>
+          <w:bCs/>
+        </w:rPr>
+        <w:t>IdeX</w:t>
+      </w:r>
+      <w:proofErr w:type="spellEnd"/>
+      <w:r>
+        <w:rPr>
+          <w:b/>
+          <w:bCs/>
+        </w:rPr>
+        <w:t>)</w:t>
+      </w:r>
+      <w:r>
+        <w:rPr>
+          <w:b/>
+          <w:bCs/>
+        </w:rPr>
+        <w:t xml:space="preserve"> (logo </w:t>
+      </w:r>
+      <w:proofErr w:type="spellStart"/>
+      <w:r>
+        <w:rPr>
+          <w:b/>
+          <w:bCs/>
+        </w:rPr>
+        <w:t>Idex</w:t>
+      </w:r>
+      <w:proofErr w:type="spellEnd"/>
       <w:r>
         <w:rPr>
           <w:b/>
@@ -1645,7 +2086,23 @@
           <w:b/>
           <w:bCs/>
         </w:rPr>
-        <w:t xml:space="preserve"> en dessous avec lien vers la page Idex).</w:t>
+        <w:t xml:space="preserve"> en dessous avec lien vers la page </w:t>
+      </w:r>
+      <w:proofErr w:type="spellStart"/>
+      <w:r>
+        <w:rPr>
+          <w:b/>
+          <w:bCs/>
+        </w:rPr>
+        <w:t>Idex</w:t>
+      </w:r>
+      <w:proofErr w:type="spellEnd"/>
+      <w:r>
+        <w:rPr>
+          <w:b/>
+          <w:bCs/>
+        </w:rPr>
+        <w:t>).</w:t>
       </w:r>
     </w:p>
     <w:p>
@@ -1736,7 +2193,15 @@
         <w:t xml:space="preserve"> approche pluridisciplinaire </w:t>
       </w:r>
       <w:r>
-        <w:t xml:space="preserve">et syndémique </w:t>
+        <w:t xml:space="preserve">et </w:t>
+      </w:r>
+      <w:proofErr w:type="spellStart"/>
+      <w:r>
+        <w:t>syndémique</w:t>
+      </w:r>
+      <w:proofErr w:type="spellEnd"/>
+      <w:r>
+        <w:t xml:space="preserve"> </w:t>
       </w:r>
       <w:r>
         <w:t>pour analyser</w:t>
@@ -1970,8 +2435,9 @@
           <w:sz w:val="28"/>
           <w:szCs w:val="28"/>
         </w:rPr>
-        <w:t xml:space="preserve">Dans l’ </w:t>
-      </w:r>
+        <w:t xml:space="preserve">Dans </w:t>
+      </w:r>
+      <w:proofErr w:type="gramStart"/>
       <w:r>
         <w:rPr>
           <w:b/>
@@ -1979,7 +2445,7 @@
           <w:sz w:val="28"/>
           <w:szCs w:val="28"/>
         </w:rPr>
-        <w:t xml:space="preserve">Onglet </w:t>
+        <w:t xml:space="preserve">l’ </w:t>
       </w:r>
       <w:r>
         <w:rPr>
@@ -1988,8 +2454,9 @@
           <w:sz w:val="28"/>
           <w:szCs w:val="28"/>
         </w:rPr>
-        <w:t>« Observatoire »</w:t>
-      </w:r>
+        <w:t>Onglet</w:t>
+      </w:r>
+      <w:proofErr w:type="gramEnd"/>
       <w:r>
         <w:rPr>
           <w:b/>
@@ -1997,6 +2464,24 @@
           <w:sz w:val="28"/>
           <w:szCs w:val="28"/>
         </w:rPr>
+        <w:t xml:space="preserve"> </w:t>
+      </w:r>
+      <w:r>
+        <w:rPr>
+          <w:b/>
+          <w:bCs/>
+          <w:sz w:val="28"/>
+          <w:szCs w:val="28"/>
+        </w:rPr>
+        <w:t>« Observatoire »</w:t>
+      </w:r>
+      <w:r>
+        <w:rPr>
+          <w:b/>
+          <w:bCs/>
+          <w:sz w:val="28"/>
+          <w:szCs w:val="28"/>
+        </w:rPr>
         <w:t xml:space="preserve"> ajouter ce texte</w:t>
       </w:r>
     </w:p>
@@ -2268,7 +2753,15 @@
         <w:t xml:space="preserve">comme les </w:t>
       </w:r>
       <w:r>
-        <w:t>pharmacies, EHPAD,…)</w:t>
+        <w:t xml:space="preserve">pharmacies, </w:t>
+      </w:r>
+      <w:proofErr w:type="gramStart"/>
+      <w:r>
+        <w:t>EHPAD,…</w:t>
+      </w:r>
+      <w:proofErr w:type="gramEnd"/>
+      <w:r>
+        <w:t>)</w:t>
       </w:r>
       <w:r>
         <w:t>.</w:t>
@@ -2323,8 +2816,17 @@
           <w:sz w:val="36"/>
           <w:szCs w:val="36"/>
         </w:rPr>
-        <w:t>Autres modifs</w:t>
-      </w:r>
+        <w:t xml:space="preserve">Autres </w:t>
+      </w:r>
+      <w:proofErr w:type="spellStart"/>
+      <w:r>
+        <w:rPr>
+          <w:sz w:val="36"/>
+          <w:szCs w:val="36"/>
+        </w:rPr>
+        <w:t>modifs</w:t>
+      </w:r>
+      <w:proofErr w:type="spellEnd"/>
     </w:p>
     <w:p>
       <w:pPr>
@@ -2340,9 +2842,19 @@
       <w:r>
         <w:t xml:space="preserve">Enlever les </w:t>
       </w:r>
-      <w:r>
-        <w:t>picto devant chaque item menus</w:t>
-      </w:r>
+      <w:proofErr w:type="spellStart"/>
+      <w:r>
+        <w:t>picto</w:t>
+      </w:r>
+      <w:proofErr w:type="spellEnd"/>
+      <w:r>
+        <w:t xml:space="preserve"> devant chaque </w:t>
+      </w:r>
+      <w:proofErr w:type="gramStart"/>
+      <w:r>
+        <w:t>item menus</w:t>
+      </w:r>
+      <w:proofErr w:type="gramEnd"/>
     </w:p>
     <w:p>
       <w:pPr>
@@ -2368,13 +2880,21 @@
         <w:ind w:left="708"/>
       </w:pPr>
       <w:r>
-        <w:t>Dans le header du haut (Mettre à Gauche SKEMA et mettre à droite le logo</w:t>
+        <w:t xml:space="preserve">Dans le header du haut (Mettre à Gauche SKEMA et mettre à droite le </w:t>
+      </w:r>
+      <w:proofErr w:type="gramStart"/>
+      <w:r>
+        <w:t>logo</w:t>
       </w:r>
       <w:r>
         <w:t xml:space="preserve">  </w:t>
       </w:r>
       <w:r>
-        <w:t>Université Côte d’Azur)</w:t>
+        <w:t>Université</w:t>
+      </w:r>
+      <w:proofErr w:type="gramEnd"/>
+      <w:r>
+        <w:t xml:space="preserve"> Côte d’Azur)</w:t>
       </w:r>
       <w:r>
         <w:t>. Taille du logo Université doit être de la même taille que celui de SKEMA</w:t>
@@ -2467,8 +2987,13 @@
       </w:pPr>
       <w:r>
         <w:lastRenderedPageBreak/>
-        <w:t>Mettre le logo IDex</w:t>
-      </w:r>
+        <w:t xml:space="preserve">Mettre le logo </w:t>
+      </w:r>
+      <w:proofErr w:type="spellStart"/>
+      <w:r>
+        <w:t>IDex</w:t>
+      </w:r>
+      <w:proofErr w:type="spellEnd"/>
       <w:r>
         <w:t xml:space="preserve"> avec le texte </w:t>
       </w:r>
@@ -2476,7 +3001,15 @@
         <w:t xml:space="preserve">Missions </w:t>
       </w:r>
       <w:r>
-        <w:t>(cf description</w:t>
+        <w:t>(</w:t>
+      </w:r>
+      <w:proofErr w:type="spellStart"/>
+      <w:r>
+        <w:t>cf</w:t>
+      </w:r>
+      <w:proofErr w:type="spellEnd"/>
+      <w:r>
+        <w:t xml:space="preserve"> description</w:t>
       </w:r>
       <w:r>
         <w:t xml:space="preserve"> changement contenu Missions)</w:t>
@@ -2514,7 +3047,15 @@
         <w:t xml:space="preserve"> sur les points suivants</w:t>
       </w:r>
       <w:r>
-        <w:t xml:space="preserve"> (cf SKEMA)</w:t>
+        <w:t xml:space="preserve"> (</w:t>
+      </w:r>
+      <w:proofErr w:type="spellStart"/>
+      <w:r>
+        <w:t>cf</w:t>
+      </w:r>
+      <w:proofErr w:type="spellEnd"/>
+      <w:r>
+        <w:t xml:space="preserve"> SKEMA)</w:t>
       </w:r>
     </w:p>
     <w:p>
@@ -2525,7 +3066,7 @@
           <w:numId w:val="8"/>
         </w:numPr>
       </w:pPr>
-      <w:hyperlink r:id="rId24" w:history="1">
+      <w:hyperlink r:id="rId23" w:history="1">
         <w:r>
           <w:rPr>
             <w:rStyle w:val="Lienhypertexte"/>
@@ -2542,7 +3083,7 @@
           <w:numId w:val="8"/>
         </w:numPr>
       </w:pPr>
-      <w:hyperlink r:id="rId25" w:history="1">
+      <w:hyperlink r:id="rId24" w:history="1">
         <w:r>
           <w:rPr>
             <w:rStyle w:val="Lienhypertexte"/>
@@ -2562,7 +3103,7 @@
           <w:numId w:val="8"/>
         </w:numPr>
       </w:pPr>
-      <w:hyperlink r:id="rId26" w:history="1">
+      <w:hyperlink r:id="rId25" w:history="1">
         <w:r>
           <w:rPr>
             <w:rStyle w:val="Lienhypertexte"/>
@@ -2656,7 +3197,15 @@
         <w:t xml:space="preserve">e supprimer et </w:t>
       </w:r>
       <w:r>
-        <w:t xml:space="preserve">de l’intégrer avec l’observatoire. Je dois encore réfléchir à quels contenu mettre en Open data. Ce qui serait bien c’est de mettre à disposition l’ensemble des données à l’aide d’un accès comme on en a parlé. </w:t>
+        <w:t xml:space="preserve">de l’intégrer avec l’observatoire. Je dois encore réfléchir à </w:t>
+      </w:r>
+      <w:proofErr w:type="gramStart"/>
+      <w:r>
+        <w:t>quels contenu</w:t>
+      </w:r>
+      <w:proofErr w:type="gramEnd"/>
+      <w:r>
+        <w:t xml:space="preserve"> mettre en Open data. Ce qui serait bien c’est de mettre à disposition l’ensemble des données à l’aide d’un accès comme on en a parlé. </w:t>
       </w:r>
     </w:p>
     <w:p>
@@ -4475,6 +5024,7 @@
   <w:style w:type="character" w:default="1" w:styleId="Policepardfaut">
     <w:name w:val="Default Paragraph Font"/>
     <w:uiPriority w:val="1"/>
+    <w:semiHidden/>
     <w:unhideWhenUsed/>
   </w:style>
   <w:style w:type="table" w:default="1" w:styleId="TableauNormal">

</xml_diff>